<commit_message>
Fix bankruptcy eligibility checks
</commit_message>
<xml_diff>
--- a/forms/mfc-extrajudicial-bankruptcy-application.docx
+++ b/forms/mfc-extrajudicial-bankruptcy-application.docx
@@ -317,7 +317,7 @@
         <w:pStyle w:val="ListBullet"/>
       </w:pPr>
       <w:r>
-        <w:t>[ ] Основной доход - пенсия или гражданин принимал участие в СВО; исполнительный документ выдан не позднее чем за 1 год до обращения, предъявлялся к исполнению и не исполнен полностью; имущества для взыскания нет.</w:t>
+        <w:t>[ ] Основной доход - пенсия или гражданин принимал участие в СВО; исполнительному документу уже 1 год или больше, он предъявлялся к исполнению и не исполнен полностью; имущества для взыскания нет.</w:t>
       </w:r>
     </w:p>
     <w:p>
@@ -325,7 +325,7 @@
         <w:pStyle w:val="ListBullet"/>
       </w:pPr>
       <w:r>
-        <w:t>[ ] Получаю ежемесячное пособие на ребенка; исполнительный документ выдан не позднее чем за 1 год до обращения, предъявлялся к исполнению и не исполнен полностью; имущества для взыскания нет.</w:t>
+        <w:t>[ ] Получаю ежемесячное пособие на ребенка; исполнительному документу уже 1 год или больше, он предъявлялся к исполнению и не исполнен полностью; имущества для взыскания нет.</w:t>
       </w:r>
     </w:p>
     <w:p>
@@ -333,7 +333,7 @@
         <w:pStyle w:val="ListBullet"/>
       </w:pPr>
       <w:r>
-        <w:t>[ ] Исполнительный документ выдан не позднее чем за 7 лет до обращения, предъявлялся к исполнению и не исполнен полностью.</w:t>
+        <w:t>[ ] Исполнительному документу уже 7 лет или больше, он предъявлялся к исполнению и не исполнен полностью.</w:t>
       </w:r>
     </w:p>
     <w:p>

</xml_diff>

<commit_message>
Polish MFC eligibility wording
</commit_message>
<xml_diff>
--- a/forms/mfc-extrajudicial-bankruptcy-application.docx
+++ b/forms/mfc-extrajudicial-bankruptcy-application.docx
@@ -309,7 +309,7 @@
         <w:pStyle w:val="ListBullet"/>
       </w:pPr>
       <w:r>
-        <w:t>[ ] Исполнительное производство окончено по п. 4 ч. 1 ст. 46 Закона об исполнительном производстве, новых открытых производств после возврата нет.</w:t>
+        <w:t>[ ] Для любых граждан с оконченным исполнительным производством: исполнительный документ возвращен взыскателю по п. 4 ч. 1 ст. 46 Закона об исполнительном производстве, новых открытых производств после возврата нет.</w:t>
       </w:r>
     </w:p>
     <w:p>
@@ -317,7 +317,7 @@
         <w:pStyle w:val="ListBullet"/>
       </w:pPr>
       <w:r>
-        <w:t>[ ] Основной доход - пенсия или гражданин принимал участие в СВО; исполнительному документу уже 1 год или больше, он предъявлялся к исполнению и не исполнен полностью; имущества для взыскания нет.</w:t>
+        <w:t>[ ] Для пенсионеров или граждан, принимающих либо принимавших участие в СВО: исполнительному документу уже 1 год или больше, он предъявлялся к исполнению и не исполнен полностью; имущества для взыскания нет.</w:t>
       </w:r>
     </w:p>
     <w:p>
@@ -325,7 +325,7 @@
         <w:pStyle w:val="ListBullet"/>
       </w:pPr>
       <w:r>
-        <w:t>[ ] Получаю ежемесячное пособие на ребенка; исполнительному документу уже 1 год или больше, он предъявлялся к исполнению и не исполнен полностью; имущества для взыскания нет.</w:t>
+        <w:t>[ ] Для граждан, получающих ежемесячное пособие в связи с рождением и воспитанием ребёнка: исполнительному документу уже 1 год или больше, он предъявлялся к исполнению и не исполнен полностью; имущества для взыскания нет.</w:t>
       </w:r>
     </w:p>
     <w:p>
@@ -333,7 +333,7 @@
         <w:pStyle w:val="ListBullet"/>
       </w:pPr>
       <w:r>
-        <w:t>[ ] Исполнительному документу уже 7 лет или больше, он предъявлялся к исполнению и не исполнен полностью.</w:t>
+        <w:t>[ ] Для длительного исполнения более 7 лет: исполнение по исполнительному документу длится более 7 лет и не завершено полным исполнением.</w:t>
       </w:r>
     </w:p>
     <w:p>

</xml_diff>